<commit_message>
docs: broaden AP-GARSS abstract framing
</commit_message>
<xml_diff>
--- a/docs/paper/apgarss_xuannv_abstract_20260708.docx
+++ b/docs/paper/apgarss_xuannv_abstract_20260708.docx
@@ -4,24 +4,73 @@
   <w:body>
     <w:p>
       <w:pPr>
+        <w:spacing w:after="140" w:line="240" w:lineRule="auto"/>
         <w:jc w:val="center"/>
       </w:pPr>
       <w:r>
         <w:rPr>
           <w:rFonts w:ascii="Times New Roman" w:hAnsi="Times New Roman" w:eastAsia="Times New Roman"/>
           <w:b/>
+          <w:i w:val="0"/>
           <w:sz w:val="28"/>
         </w:rPr>
-        <w:t>Xuannv: Monthly Multimodal Geospatial Embeddings for Sparse-Label Urban Mapping</w:t>
+        <w:t>Xuannv: A Monthly Multimodal Geospatial Foundation Embedding for Scalable Sparse-Label Urban Mapping</w:t>
       </w:r>
     </w:p>
     <w:p>
       <w:pPr>
+        <w:spacing w:after="40" w:line="240" w:lineRule="auto"/>
         <w:jc w:val="center"/>
       </w:pPr>
       <w:r>
         <w:rPr>
           <w:rFonts w:ascii="Times New Roman" w:hAnsi="Times New Roman" w:eastAsia="Times New Roman"/>
+          <w:b w:val="0"/>
+          <w:i w:val="0"/>
+          <w:sz w:val="20"/>
+        </w:rPr>
+        <w:t>Weijie Wu, Xinyi Fan, and Long Zhao</w:t>
+      </w:r>
+    </w:p>
+    <w:p>
+      <w:pPr>
+        <w:spacing w:after="40" w:line="240" w:lineRule="auto"/>
+        <w:jc w:val="center"/>
+      </w:pPr>
+      <w:r>
+        <w:rPr>
+          <w:rFonts w:ascii="Times New Roman" w:hAnsi="Times New Roman" w:eastAsia="Times New Roman"/>
+          <w:b w:val="0"/>
+          <w:i/>
+          <w:sz w:val="18"/>
+        </w:rPr>
+        <w:t>University of Chinese Academy of Sciences; Aerospace Information Research Institute, Chinese Academy of Sciences</w:t>
+      </w:r>
+    </w:p>
+    <w:p>
+      <w:pPr>
+        <w:spacing w:after="140" w:line="240" w:lineRule="auto"/>
+        <w:jc w:val="center"/>
+      </w:pPr>
+      <w:r>
+        <w:rPr>
+          <w:rFonts w:ascii="Times New Roman" w:hAnsi="Times New Roman" w:eastAsia="Times New Roman"/>
+          <w:b w:val="0"/>
+          <w:i/>
+          <w:sz w:val="18"/>
+        </w:rPr>
+        <w:t>Corresponding Author: Weijie Wu, wuweijie25@mails.ucas.ac.cn</w:t>
+      </w:r>
+    </w:p>
+    <w:p>
+      <w:pPr>
+        <w:spacing w:after="200" w:line="240" w:lineRule="auto"/>
+        <w:jc w:val="center"/>
+      </w:pPr>
+      <w:r>
+        <w:rPr>
+          <w:rFonts w:ascii="Times New Roman" w:hAnsi="Times New Roman" w:eastAsia="Times New Roman"/>
+          <w:b w:val="0"/>
           <w:i/>
           <w:sz w:val="20"/>
         </w:rPr>
@@ -30,12 +79,14 @@
     </w:p>
     <w:p>
       <w:pPr>
+        <w:spacing w:after="120" w:line="240" w:lineRule="auto"/>
         <w:jc w:val="center"/>
       </w:pPr>
       <w:r>
         <w:rPr>
           <w:rFonts w:ascii="Times New Roman" w:hAnsi="Times New Roman" w:eastAsia="Times New Roman"/>
           <w:b/>
+          <w:i w:val="0"/>
           <w:sz w:val="22"/>
         </w:rPr>
         <w:t>Abstract</w:t>
@@ -43,41 +94,47 @@
     </w:p>
     <w:p>
       <w:pPr>
-        <w:spacing w:after="120" w:line="240" w:lineRule="auto"/>
+        <w:spacing w:after="100" w:line="240" w:lineRule="auto"/>
         <w:ind w:firstLine="259"/>
         <w:jc w:val="both"/>
       </w:pPr>
       <w:r>
         <w:rPr>
           <w:rFonts w:ascii="Times New Roman" w:hAnsi="Times New Roman" w:eastAsia="Times New Roman"/>
+          <w:b w:val="0"/>
+          <w:i w:val="0"/>
           <w:sz w:val="20"/>
         </w:rPr>
-        <w:t>Urban remote-sensing applications require frequently updated maps of buildings, roads, water bodies, green spaces, schools, sports facilities, and other fine-grained urban objects. However, dense manual annotation is expensive, task-specific models are difficult to reuse, and raw multi-source imagery often requires substantial engineering effort before it can be adapted to a new mapping target. This work presents Xuannv, a monthly multimodal geospatial embedding model for sparse-label urban mapping. Xuannv is trained over Haidian District, Beijing, using 320 spatial patches and six monthly observations from December 2025 to May 2026. The training data integrate Sentinel-2 optical imagery, Sentinel-1 SAR, Landsat observations, high-resolution optical imagery, high-resolution SAR imagery, and OpenStreetMap-derived weak semantic labels. The model produces 10 m, 64-dimensional dense embedding maps that can be reused by different downstream heads.</w:t>
+        <w:t>Urban remote-sensing applications increasingly require frequently updated, fine-grained maps of buildings, roads, water bodies, green spaces, schools, sports facilities, and other urban objects. However, conventional task-specific models depend on dense annotations, are costly to update, and rarely transfer across mapping targets. Inspired by recent geospatial foundation model practice, we present Xuannv, a monthly multimodal geospatial foundation embedding framework for scalable sparse-label urban mapping. Rather than treating each target as an isolated segmentation problem, Xuannv converts heterogeneous Earth observation data into reusable dense embeddings that can support many downstream tasks with lightweight heads and limited labels. We instantiate and validate the framework over Haidian District, Beijing, using 320 spatial patches and six monthly observations from December 2025 to May 2026. The training data integrate Sentinel-2 optical imagery, Sentinel-1 SAR, Landsat observations, high-resolution optical imagery, high-resolution SAR imagery, and OpenStreetMap-derived weak semantic labels. The model produces 10 m, 64-dimensional dense embedding maps that can be reused by different downstream heads.</w:t>
       </w:r>
     </w:p>
     <w:p>
       <w:pPr>
-        <w:spacing w:after="120" w:line="240" w:lineRule="auto"/>
+        <w:spacing w:after="100" w:line="240" w:lineRule="auto"/>
         <w:ind w:firstLine="259"/>
         <w:jc w:val="both"/>
       </w:pPr>
       <w:r>
         <w:rPr>
           <w:rFonts w:ascii="Times New Roman" w:hAnsi="Times New Roman" w:eastAsia="Times New Roman"/>
+          <w:b w:val="0"/>
+          <w:i w:val="0"/>
           <w:sz w:val="20"/>
         </w:rPr>
-        <w:t>Instead of training an independent network for every urban mapping task, Xuannv learns a shared representation that preserves multi-sensor appearance, high-resolution spatial detail, and weak urban semantics. The training objective combines multi-source reconstruction, high-resolution reconstruction, OSM weak semantic supervision, hard reconstruction with masked inputs, and context-aware patch cropping to improve spatial continuity. After pre-training, the encoder is frozen and evaluated under a unified downstream protocol. Lightweight linear, MLP, and spatial heads are trained with sparse labels for building extraction, road extraction, water detection, urban semantic mapping, and query-by-example retrieval. All downstream comparisons use the same train/validation/test split, validation-selected thresholds, and identical label budgets to reduce protocol-driven bias.</w:t>
+        <w:t>Xuannv is trained to preserve multi-sensor appearance, high-resolution spatial detail, temporal surface state, and weak urban semantics in a unified representation. Its objective combines multi-source reconstruction, high-resolution reconstruction, OSM weak semantic supervision, hard reconstruction with masked inputs, and context-aware patch cropping to improve spatial continuity across neighboring tiles. After pre-training, the encoder is frozen and evaluated under a unified downstream protocol. Lightweight linear, MLP, and spatial heads are trained with sparse labels for building extraction, road extraction, water detection, urban semantic mapping, and query-by-example retrieval. All downstream comparisons use the same train/validation/test split, validation-selected thresholds, and identical label budgets to reduce protocol-driven bias.</w:t>
       </w:r>
     </w:p>
     <w:p>
       <w:pPr>
-        <w:spacing w:after="120" w:line="240" w:lineRule="auto"/>
+        <w:spacing w:after="100" w:line="240" w:lineRule="auto"/>
         <w:ind w:firstLine="259"/>
         <w:jc w:val="both"/>
       </w:pPr>
       <w:r>
         <w:rPr>
           <w:rFonts w:ascii="Times New Roman" w:hAnsi="Times New Roman" w:eastAsia="Times New Roman"/>
+          <w:b w:val="0"/>
+          <w:i w:val="0"/>
           <w:sz w:val="20"/>
         </w:rPr>
         <w:t>Experiments show that Xuannv is especially effective when labels are limited. In the 5-shot setting, compared with strong raw-feature baselines trained directly on multi-source imagery, Xuannv improves F1 by 9.8%, 18.3%, and 41.5% on building, road, and water extraction, respectively. In the 50-shot six-task benchmark covering buildings, roads, water, park/green space, education areas, and sports pitches, Xuannv achieves an average F1 of 0.552 and outperforms raw-feature supervised models on five of six tasks. Even simple MLP heads obtain usable performance on several categories, indicating that the learned embeddings encode transferable urban semantics rather than only task-specific cues.</w:t>
@@ -85,25 +142,29 @@
     </w:p>
     <w:p>
       <w:pPr>
-        <w:spacing w:after="120" w:line="240" w:lineRule="auto"/>
+        <w:spacing w:after="100" w:line="240" w:lineRule="auto"/>
         <w:ind w:firstLine="259"/>
         <w:jc w:val="both"/>
       </w:pPr>
       <w:r>
         <w:rPr>
           <w:rFonts w:ascii="Times New Roman" w:hAnsi="Times New Roman" w:eastAsia="Times New Roman"/>
+          <w:b w:val="0"/>
+          <w:i w:val="0"/>
           <w:sz w:val="20"/>
         </w:rPr>
-        <w:t>The project is designed as an open GeoAI practice workflow. We will release trained weights, monthly embeddings, training configurations, data documentation, downstream evaluation scripts, visualization examples, and reproducible ModelScope notebooks. These resources are intended to let users inspect the learned embedding space, reproduce the reported metrics, and quickly build new sparse-label mapping heads for additional urban categories. By converting complex multi-source remote-sensing data into reusable monthly embeddings, Xuannv provides a practical path for rapid urban mapping with limited manual labels and offers a reproducible foundation for further research on regional geospatial representation learning.</w:t>
+        <w:t>The project is designed as an open GeoAI practice workflow rather than a closed single-task model. We will release trained weights, monthly embeddings, training configurations, data documentation, downstream evaluation scripts, visualization examples, and reproducible ModelScope notebooks. These resources are intended to let users inspect the learned embedding space, reproduce the reported metrics, and quickly build new sparse-label mapping heads for additional urban categories. By converting complex multi-source remote-sensing data into reusable monthly embeddings, Xuannv provides a practical path for rapid urban mapping with limited manual labels and offers a reproducible foundation for future regional geospatial representation learning.</w:t>
       </w:r>
     </w:p>
     <w:p>
       <w:pPr>
+        <w:spacing w:after="0" w:line="240" w:lineRule="auto"/>
         <w:jc w:val="both"/>
       </w:pPr>
       <w:r>
         <w:rPr>
           <w:rFonts w:ascii="Times New Roman" w:hAnsi="Times New Roman" w:eastAsia="Times New Roman"/>
+          <w:b w:val="0"/>
           <w:i/>
           <w:sz w:val="20"/>
         </w:rPr>
@@ -112,7 +173,7 @@
     </w:p>
     <w:sectPr>
       <w:pgSz w:w="11909" w:h="16834"/>
-      <w:pgMar w:top="1440" w:right="1440" w:bottom="1440" w:left="1440" w:header="720" w:footer="720" w:gutter="0"/>
+      <w:pgMar w:top="1152" w:right="1296" w:bottom="1152" w:left="1296" w:header="720" w:footer="720" w:gutter="0"/>
       <w:cols w:space="720"/>
       <w:docGrid w:linePitch="360"/>
     </w:sectPr>

</xml_diff>

<commit_message>
docs: correct AP-GARSS authors and affiliations
</commit_message>
<xml_diff>
--- a/docs/paper/apgarss_xuannv_abstract_20260708.docx
+++ b/docs/paper/apgarss_xuannv_abstract_20260708.docx
@@ -19,7 +19,7 @@
     </w:p>
     <w:p>
       <w:pPr>
-        <w:spacing w:after="40" w:line="240" w:lineRule="auto"/>
+        <w:spacing w:after="40"/>
         <w:jc w:val="center"/>
       </w:pPr>
       <w:r>
@@ -29,7 +29,55 @@
           <w:i w:val="0"/>
           <w:sz w:val="20"/>
         </w:rPr>
-        <w:t>Weijie Wu, Xinyi Fan, and Long Zhao</w:t>
+        <w:t>Weijie Wu</w:t>
+      </w:r>
+      <w:r>
+        <w:rPr>
+          <w:rFonts w:ascii="Times New Roman" w:hAnsi="Times New Roman" w:eastAsia="Times New Roman"/>
+          <w:b w:val="0"/>
+          <w:i w:val="0"/>
+          <w:sz w:val="18"/>
+          <w:vertAlign w:val="superscript"/>
+        </w:rPr>
+        <w:t>1</w:t>
+      </w:r>
+      <w:r>
+        <w:rPr>
+          <w:rFonts w:ascii="Times New Roman" w:hAnsi="Times New Roman" w:eastAsia="Times New Roman"/>
+          <w:b w:val="0"/>
+          <w:i w:val="0"/>
+          <w:sz w:val="20"/>
+        </w:rPr>
+        <w:t>, Xinyi Fan</w:t>
+      </w:r>
+      <w:r>
+        <w:rPr>
+          <w:rFonts w:ascii="Times New Roman" w:hAnsi="Times New Roman" w:eastAsia="Times New Roman"/>
+          <w:b w:val="0"/>
+          <w:i w:val="0"/>
+          <w:sz w:val="18"/>
+          <w:vertAlign w:val="superscript"/>
+        </w:rPr>
+        <w:t>2</w:t>
+      </w:r>
+      <w:r>
+        <w:rPr>
+          <w:rFonts w:ascii="Times New Roman" w:hAnsi="Times New Roman" w:eastAsia="Times New Roman"/>
+          <w:b w:val="0"/>
+          <w:i w:val="0"/>
+          <w:sz w:val="20"/>
+        </w:rPr>
+        <w:t>, and Long Zhao</w:t>
+      </w:r>
+      <w:r>
+        <w:rPr>
+          <w:rFonts w:ascii="Times New Roman" w:hAnsi="Times New Roman" w:eastAsia="Times New Roman"/>
+          <w:b w:val="0"/>
+          <w:i w:val="0"/>
+          <w:sz w:val="18"/>
+          <w:vertAlign w:val="superscript"/>
+        </w:rPr>
+        <w:t>1</w:t>
       </w:r>
     </w:p>
     <w:p>
@@ -44,7 +92,7 @@
           <w:i/>
           <w:sz w:val="18"/>
         </w:rPr>
-        <w:t>University of Chinese Academy of Sciences; Aerospace Information Research Institute, Chinese Academy of Sciences</w:t>
+        <w:t>1 Aerospace Information Research Institute, Chinese Academy of Sciences; 2 Institute of Geographic Sciences and Natural Resources Research, Chinese Academy of Sciences</w:t>
       </w:r>
     </w:p>
     <w:p>
@@ -59,7 +107,7 @@
           <w:i/>
           <w:sz w:val="18"/>
         </w:rPr>
-        <w:t>Corresponding Author: Weijie Wu, wuweijie25@mails.ucas.ac.cn</w:t>
+        <w:t>Corresponding Author: Long Zhao, zhaolong@aircas.ac.cn</w:t>
       </w:r>
     </w:p>
     <w:p>

</xml_diff>

<commit_message>
docs: update AP-GARSS abstract with dual-region results
</commit_message>
<xml_diff>
--- a/docs/paper/apgarss_xuannv_abstract_20260708.docx
+++ b/docs/paper/apgarss_xuannv_abstract_20260708.docx
@@ -14,7 +14,7 @@
           <w:i w:val="0"/>
           <w:sz w:val="28"/>
         </w:rPr>
-        <w:t>Xuannv: A Monthly Multimodal Geospatial Foundation Embedding for Scalable Sparse-Label Urban Mapping</w:t>
+        <w:t>XuannvEarth: Toward China-Scale Monthly Geospatial Embeddings for Robust Mapping and Change Detection</w:t>
       </w:r>
     </w:p>
     <w:p>
@@ -153,7 +153,7 @@
           <w:i w:val="0"/>
           <w:sz w:val="20"/>
         </w:rPr>
-        <w:t>Urban remote-sensing applications increasingly require frequently updated, fine-grained maps of buildings, roads, water bodies, green spaces, schools, sports facilities, and other urban objects. However, conventional task-specific models depend on dense annotations, are costly to update, and rarely transfer across mapping targets. Inspired by recent geospatial foundation model practice, we present Xuannv, a monthly multimodal geospatial foundation embedding framework for scalable sparse-label urban mapping. Rather than treating each target as an isolated segmentation problem, Xuannv converts heterogeneous Earth observation data into reusable dense embeddings that can support many downstream tasks with lightweight heads and limited labels. We instantiate and validate the framework over Haidian District, Beijing, using 320 spatial patches and six monthly observations from December 2025 to May 2026. The training data integrate Sentinel-2 optical imagery, Sentinel-1 SAR, Landsat observations, high-resolution optical imagery, high-resolution SAR imagery, and OpenStreetMap-derived weak semantic labels. The model produces 10 m, 64-dimensional dense embedding maps that can be reused by different downstream heads.</w:t>
+        <w:t>China's urban and regional governance increasingly requires monthly, fine-grained maps of buildings, roads, water bodies, green spaces, construction activities, and land-cover changes. However, operational remote sensing is rarely clean: optical observations are often affected by clouds, haze, snow, seasonal appearance shifts, and missing acquisitions, while dense task-specific annotations are expensive to update. We present XuannvEarth, a monthly multimodal geospatial embedding framework that converts heterogeneous Earth observation data into reusable dense representations for robust mapping and change detection. A central idea is to generate the embedding once and reuse it across many downstream tasks by attaching simple linear, MLP, convolutional, or lightweight segmentation heads, instead of retraining a separate heavy model for every target. The current system is validated in two representative regions: Haidian District, Beijing, for fine-grained urban semantic mapping, and Harbin New Area for bitemporal land-change detection under imperfect observations. XuannvEarth integrates Sentinel-2 optical imagery, Sentinel-1 SAR, Landsat observations, high-resolution optical imagery, high-resolution SAR imagery, and OpenStreetMap-derived weak semantic labels to produce 10 m, 64-dimensional monthly embedding maps.</w:t>
       </w:r>
     </w:p>
     <w:p>
@@ -169,7 +169,7 @@
           <w:i w:val="0"/>
           <w:sz w:val="20"/>
         </w:rPr>
-        <w:t>Xuannv is trained to preserve multi-sensor appearance, high-resolution spatial detail, temporal surface state, and weak urban semantics in a unified representation. Its objective combines multi-source reconstruction, high-resolution reconstruction, OSM weak semantic supervision, hard reconstruction with masked inputs, and context-aware patch cropping to improve spatial continuity across neighboring tiles. After pre-training, the encoder is frozen and evaluated under a unified downstream protocol. Lightweight linear, MLP, and spatial heads are trained with sparse labels for building extraction, road extraction, water detection, urban semantic mapping, and query-by-example retrieval. All downstream comparisons use the same train/validation/test split, validation-selected thresholds, and identical label budgets to reduce protocol-driven bias.</w:t>
+        <w:t>XuannvEarth is trained to preserve multi-sensor appearance, high-resolution spatial detail, monthly surface state, and weak urban semantics in a unified representation. Its objective uses reconstruction-and-weak-supervision learning with masked-source training and context-aware patch cropping, encouraging the embedding to remain informative when one data source is missing or when optical imagery is partially contaminated by clouds or haze. After pre-training, the encoder is frozen and evaluated under a unified downstream protocol, where train/validation/test splits, validation-selected thresholds, and label budgets are kept consistent.</w:t>
       </w:r>
     </w:p>
     <w:p>
@@ -185,7 +185,7 @@
           <w:i w:val="0"/>
           <w:sz w:val="20"/>
         </w:rPr>
-        <w:t>Experiments show that Xuannv is especially effective when labels are limited. In the 5-shot setting, compared with strong raw-feature baselines trained directly on multi-source imagery, Xuannv improves F1 by 9.8%, 18.3%, and 41.5% on building, road, and water extraction, respectively. In the 50-shot six-task benchmark covering buildings, roads, water, park/green space, education areas, and sports pitches, Xuannv achieves an average F1 of 0.552 and outperforms raw-feature supervised models on five of six tasks. Even simple MLP heads obtain usable performance on several categories, indicating that the learned embeddings encode transferable urban semantics rather than only task-specific cues.</w:t>
+        <w:t>Experiments show that the same generated embeddings support both semantic mapping and change detection. In Haidian, under a 5-shot setting, XuannvEarth is compared with raw 2026-04 multisource-feature baselines built from stacked Sentinel-2, Sentinel-1, Landsat, high-resolution optical/SAR features and candidate heads including Conv3x3, MLP, U-Net, and DeepLab-lite. It improves F1 by 9.8%, 18.3%, and 41.5% on building, road, and water extraction, respectively. In a 50-shot six-task benchmark, XuannvEarth with lightweight or spatial heads achieves an average F1 of 0.552 and outperforms raw-feature supervised U-Net, DeepLab-lite, or SegFormer-lite baselines on five of six urban mapping tasks. In Harbin New Area, five-fold bitemporal evaluations reach AUC values of 0.962, 0.945, and 0.995 for building change, farmland change, and rubbish or land-surface change, outperforming the AEF annual embedding baseline on these tasks and demonstrating robustness under cloud and source-availability issues.</w:t>
       </w:r>
     </w:p>
     <w:p>
@@ -201,7 +201,7 @@
           <w:i w:val="0"/>
           <w:sz w:val="20"/>
         </w:rPr>
-        <w:t>The project is designed as an open GeoAI practice workflow rather than a closed single-task model. We will release trained weights, monthly embeddings, training configurations, data documentation, downstream evaluation scripts, visualization examples, and reproducible ModelScope notebooks. These resources are intended to let users inspect the learned embedding space, reproduce the reported metrics, and quickly build new sparse-label mapping heads for additional urban categories. By converting complex multi-source remote-sensing data into reusable monthly embeddings, Xuannv provides a practical path for rapid urban mapping with limited manual labels and offers a reproducible foundation for future regional geospatial representation learning.</w:t>
+        <w:t>The project is designed as an open GeoAI workflow rather than a closed single-task model. We will release trained weights, monthly embeddings, training configurations, data documentation, downstream evaluation scripts, visualization examples, and reproducible ModelScope notebooks. Looking forward, we aim to scale XuannvEarth from regional validation to a China-oriented monthly geospatial embedding foundation, enabling robust sparse-label mapping, query-by-example retrieval, and land-change monitoring across diverse Chinese landscapes.</w:t>
       </w:r>
     </w:p>
     <w:p>
@@ -216,7 +216,7 @@
           <w:i/>
           <w:sz w:val="20"/>
         </w:rPr>
-        <w:t>Index Terms--geospatial embeddings, remote sensing foundation models, sparse-label mapping, urban GeoAI, multimodal representation learning, ModelScope</w:t>
+        <w:t>Index Terms--geospatial embeddings, remote sensing foundation models, sparse-label mapping, change detection, multimodal representation learning, ModelScope</w:t>
       </w:r>
     </w:p>
     <w:sectPr>

</xml_diff>

<commit_message>
docs: clarify AP-GARSS baseline comparison
</commit_message>
<xml_diff>
--- a/docs/paper/apgarss_xuannv_abstract_20260708.docx
+++ b/docs/paper/apgarss_xuannv_abstract_20260708.docx
@@ -14,7 +14,7 @@
           <w:i w:val="0"/>
           <w:sz w:val="28"/>
         </w:rPr>
-        <w:t>XuannvEarth: Toward China-Scale Monthly Geospatial Embeddings for Robust Mapping and Change Detection</w:t>
+        <w:t>XuannvEarth: Toward China-Scale Monthly Geospatial Embeddings for Reusable Sparse-Label Mapping</w:t>
       </w:r>
     </w:p>
     <w:p>
@@ -153,7 +153,7 @@
           <w:i w:val="0"/>
           <w:sz w:val="20"/>
         </w:rPr>
-        <w:t>China's urban and regional governance increasingly requires monthly, fine-grained maps of buildings, roads, water bodies, green spaces, construction activities, and land-cover changes. However, operational remote sensing is rarely clean: optical observations are often affected by clouds, haze, snow, seasonal appearance shifts, and missing acquisitions, while dense task-specific annotations are expensive to update. We present XuannvEarth, a monthly multimodal geospatial embedding framework that converts heterogeneous Earth observation data into reusable dense representations for robust mapping and change detection. A central idea is to generate the embedding once and reuse it across many downstream tasks by attaching simple linear, MLP, convolutional, or lightweight segmentation heads, instead of retraining a separate heavy model for every target. The current system is validated in two representative regions: Haidian District, Beijing, for fine-grained urban semantic mapping, and Harbin New Area for bitemporal land-change detection under imperfect observations. XuannvEarth integrates Sentinel-2 optical imagery, Sentinel-1 SAR, Landsat observations, high-resolution optical imagery, high-resolution SAR imagery, and OpenStreetMap-derived weak semantic labels to produce 10 m, 64-dimensional monthly embedding maps.</w:t>
+        <w:t>China's urban and regional governance increasingly requires monthly, fine-grained maps of buildings, roads, water bodies, green spaces, schools, sports facilities, construction activities, and other urban objects. However, dense task-specific annotations are expensive to update, and conventional mapping models are usually trained separately for each target category. We present XuannvEarth, a monthly multimodal geospatial embedding framework that converts heterogeneous Earth observation data into reusable dense representations for sparse-label urban mapping. The central idea is to generate the embedding once and reuse it across many downstream tasks by attaching simple linear, MLP, convolutional, or lightweight segmentation heads, instead of retraining a separate heavy model for every target. In this study, we validate the framework over Haidian District, Beijing, a complex urban region with dense buildings, road networks, water bodies, parks, campuses, and sports facilities. XuannvEarth integrates Sentinel-2 optical imagery, Sentinel-1 SAR, Landsat observations, high-resolution optical imagery, high-resolution SAR imagery, and OpenStreetMap-derived weak semantic labels to produce 10 m, 64-dimensional monthly embedding maps.</w:t>
       </w:r>
     </w:p>
     <w:p>
@@ -169,7 +169,7 @@
           <w:i w:val="0"/>
           <w:sz w:val="20"/>
         </w:rPr>
-        <w:t>XuannvEarth is trained to preserve multi-sensor appearance, high-resolution spatial detail, monthly surface state, and weak urban semantics in a unified representation. Its objective uses reconstruction-and-weak-supervision learning with masked-source training and context-aware patch cropping, encouraging the embedding to remain informative when one data source is missing or when optical imagery is partially contaminated by clouds or haze. After pre-training, the encoder is frozen and evaluated under a unified downstream protocol, where train/validation/test splits, validation-selected thresholds, and label budgets are kept consistent.</w:t>
+        <w:t>XuannvEarth is trained to preserve multi-sensor appearance, high-resolution spatial detail, monthly surface state, and weak urban semantics in a unified representation. Its objective uses reconstruction-and-weak-supervision learning with masked-source training and context-aware patch cropping, encouraging the embedding to learn stable surface representations rather than only task-specific classification boundaries. After pre-training, the encoder is frozen. Each downstream task only reads the generated embedding map and trains a small task head, making the workflow suitable for rapid category expansion when only a few labeled patches are available. All evaluations use a unified protocol with fixed train/validation/test splits, validation-selected thresholds, and matched label budgets.</w:t>
       </w:r>
     </w:p>
     <w:p>
@@ -185,7 +185,7 @@
           <w:i w:val="0"/>
           <w:sz w:val="20"/>
         </w:rPr>
-        <w:t>Experiments in Haidian and Harbin demonstrate that a single monthly embedding product can be reused for multiple downstream tasks. For sparse-label urban mapping in Haidian, we compare XuannvEarth with baselines trained directly from April 2026 multisensor features, including Sentinel-2, Sentinel-1, Landsat, high-resolution optical imagery, and high-resolution SAR features. These baselines use the same data splits, label budgets, validation-selected thresholds, and candidate downstream heads, including Conv3x3, MLP, U-Net, and DeepLab-lite. With only five labeled positive patches, XuannvEarth improves F1 by 9.8%, 18.3%, and 41.5% on building, road, and water extraction, respectively. With 50-shot supervision, lightweight or spatial heads on XuannvEarth embeddings achieve an average F1 of 0.552 and outperform raw-feature U-Net, DeepLab-lite, or SegFormer-lite baselines on five of six urban mapping tasks. For Harbin New Area, five-fold bitemporal evaluations further show AUC values of 0.962, 0.945, and 0.995 for building change, farmland change, and rubbish or land-surface change, outperforming the AEF annual embedding baseline and showing the potential of multisensor monthly embeddings under cloud and source-availability issues.</w:t>
+        <w:t>Experiments demonstrate that one monthly embedding product can support multiple downstream mapping tasks. For 5-shot building, road, and water extraction, we compare XuannvEarth against task-specific baselines trained directly from April 2026 multisensor features, including Sentinel-2, Sentinel-1, Landsat, high-resolution optical imagery, and high-resolution SAR features. The baselines use the same data splits, the same number of labeled patches, the same validation-threshold selection rule, and the same candidate heads, including Conv3x3, MLP, U-Net, and DeepLab-lite. The reported gains of 9.8%, 18.3%, and 41.5% in F1 are relative to the best raw-feature baseline selected separately for each task under this identical protocol. In the 50-shot six-task benchmark, XuannvEarth embeddings with lightweight or spatial heads achieve an average F1 of 0.552 and outperform raw-feature U-Net, DeepLab-lite, or SegFormer-lite baselines on five of six urban mapping tasks.</w:t>
       </w:r>
     </w:p>
     <w:p>
@@ -201,7 +201,7 @@
           <w:i w:val="0"/>
           <w:sz w:val="20"/>
         </w:rPr>
-        <w:t>The project is designed as an open GeoAI workflow rather than a closed single-task model. We will release trained weights, monthly embeddings, training configurations, data documentation, downstream evaluation scripts, visualization examples, and reproducible ModelScope notebooks. Looking forward, we aim to scale XuannvEarth from regional validation to a China-oriented monthly geospatial embedding foundation, enabling robust sparse-label mapping, query-by-example retrieval, and land-change monitoring across diverse Chinese landscapes.</w:t>
+        <w:t>The project is designed as an open GeoAI workflow rather than a closed single-task model. We will release trained weights, monthly embeddings, training configurations, data documentation, downstream evaluation scripts, visualization examples, and reproducible ModelScope notebooks. Looking forward, we aim to scale XuannvEarth from regional validation to a China-oriented monthly geospatial embedding foundation, enabling reusable sparse-label mapping, query-by-example retrieval, and rapid urban semantic analysis across diverse Chinese landscapes.</w:t>
       </w:r>
     </w:p>
     <w:p>
@@ -216,7 +216,7 @@
           <w:i/>
           <w:sz w:val="20"/>
         </w:rPr>
-        <w:t>Index Terms--geospatial embeddings, remote sensing foundation models, sparse-label mapping, change detection, multimodal representation learning, ModelScope</w:t>
+        <w:t>Index Terms--geospatial embeddings, remote sensing foundation models, sparse-label mapping, urban GeoAI, multimodal representation learning, ModelScope</w:t>
       </w:r>
     </w:p>
     <w:sectPr>

</xml_diff>